<commit_message>
Informe: evidencia en Drive
</commit_message>
<xml_diff>
--- a/AgroPulse_Informe_TP4.docx
+++ b/AgroPulse_Informe_TP4.docx
@@ -4880,7 +4880,7 @@
           <w:sz w:val="18"/>
           <w:szCs w:val="18"/>
         </w:rPr>
-        <w:t xml:space="preserve">Tabla 6. Pruebas manuales (completar la columna Resultado).</w:t>
+        <w:t xml:space="preserve">Tabla 6. Pruebas manuales (resultado registrado durante la demo; evidencia en la Tabla 7).</w:t>
       </w:r>
     </w:p>
     <w:p>
@@ -4904,6 +4904,32 @@
           <w:rFonts w:ascii="Arial" w:cs="Arial" w:eastAsia="Arial" w:hAnsi="Arial"/>
         </w:rPr>
         <w:t xml:space="preserve">Historia H1: el productor abre AgroPulse y ve que Costa 2 está en rojo. Entra y ve la humedad por debajo del umbral. Envía "regar" y en menos de 5 s la válvula figura abierta y el comando, aplicado.</w:t>
+      </w:r>
+    </w:p>
+    <w:p>
+      <w:pPr>
+        <w:spacing w:after="120" w:line="300"/>
+        <w:jc w:val="both"/>
+      </w:pPr>
+      <w:r>
+        <w:rPr>
+          <w:rFonts w:ascii="Arial" w:cs="Arial" w:eastAsia="Arial" w:hAnsi="Arial"/>
+        </w:rPr>
+        <w:t xml:space="preserve">Las capturas de pantalla y el video se entregan en la </w:t>
+      </w:r>
+      <w:r>
+        <w:rPr>
+          <w:rFonts w:ascii="Arial" w:cs="Arial" w:eastAsia="Arial" w:hAnsi="Arial"/>
+          <w:b/>
+          <w:bCs/>
+        </w:rPr>
+        <w:t xml:space="preserve">carpeta de Drive adjunta a la entrega</w:t>
+      </w:r>
+      <w:r>
+        <w:rPr>
+          <w:rFonts w:ascii="Arial" w:cs="Arial" w:eastAsia="Arial" w:hAnsi="Arial"/>
+        </w:rPr>
+        <w:t xml:space="preserve">. Los archivos están numerados en el orden del recorrido de la demo:</w:t>
       </w:r>
     </w:p>
     <w:tbl>
@@ -4919,50 +4945,1014 @@
         </w:tblBorders>
       </w:tblPr>
       <w:tblGrid>
-        <w:gridCol w:w="9000"/>
+        <w:gridCol w:w="3200"/>
+        <w:gridCol w:w="4100"/>
+        <w:gridCol w:w="1700"/>
       </w:tblGrid>
       <w:tr>
         <w:trPr>
-          <w:trHeight w:val="2600" w:hRule="atLeast"/>
+          <w:tblHeader/>
         </w:trPr>
         <w:tc>
           <w:tcPr>
-            <w:tcW w:type="dxa" w:w="9000"/>
-            <w:tcBorders>
-              <w:top w:val="dashed" w:color="8FA39A" w:sz="8"/>
-              <w:left w:val="dashed" w:color="8FA39A" w:sz="8"/>
-              <w:bottom w:val="dashed" w:color="8FA39A" w:sz="8"/>
-              <w:right w:val="dashed" w:color="8FA39A" w:sz="8"/>
-            </w:tcBorders>
-            <w:shd w:fill="F4F7F5" w:color="auto" w:val="clear"/>
-            <w:vAlign w:val="center"/>
-          </w:tcPr>
-          <w:p>
-            <w:pPr>
-              <w:jc w:val="center"/>
+            <w:tcW w:type="dxa" w:w="3200"/>
+            <w:tcBorders>
+              <w:top w:val="single" w:color="B8C4BE" w:sz="4"/>
+              <w:left w:val="single" w:color="B8C4BE" w:sz="4"/>
+              <w:bottom w:val="single" w:color="B8C4BE" w:sz="4"/>
+              <w:right w:val="single" w:color="B8C4BE" w:sz="4"/>
+            </w:tcBorders>
+            <w:shd w:fill="DCE8E1" w:color="auto" w:val="clear"/>
+            <w:tcMar>
+              <w:top w:type="dxa" w:w="60"/>
+              <w:left w:type="dxa" w:w="100"/>
+              <w:bottom w:type="dxa" w:w="60"/>
+              <w:right w:type="dxa" w:w="100"/>
+            </w:tcMar>
+          </w:tcPr>
+          <w:p>
+            <w:pPr>
+              <w:spacing w:after="0" w:line="260"/>
             </w:pPr>
             <w:r>
               <w:rPr>
                 <w:rFonts w:ascii="Arial" w:cs="Arial" w:eastAsia="Arial" w:hAnsi="Arial"/>
                 <w:b/>
                 <w:bCs/>
-                <w:color w:val="5A6B64"/>
-              </w:rPr>
-              <w:t xml:space="preserve">[ PEGAR CAPTURA ]</w:t>
-            </w:r>
-          </w:p>
-          <w:p>
-            <w:pPr>
-              <w:jc w:val="center"/>
-            </w:pPr>
-            <w:r>
-              <w:rPr>
-                <w:rFonts w:ascii="Arial" w:cs="Arial" w:eastAsia="Arial" w:hAnsi="Arial"/>
-                <w:color w:val="5A6B64"/>
+              </w:rPr>
+              <w:t xml:space="preserve">Archivo</w:t>
+            </w:r>
+          </w:p>
+        </w:tc>
+        <w:tc>
+          <w:tcPr>
+            <w:tcW w:type="dxa" w:w="4100"/>
+            <w:tcBorders>
+              <w:top w:val="single" w:color="B8C4BE" w:sz="4"/>
+              <w:left w:val="single" w:color="B8C4BE" w:sz="4"/>
+              <w:bottom w:val="single" w:color="B8C4BE" w:sz="4"/>
+              <w:right w:val="single" w:color="B8C4BE" w:sz="4"/>
+            </w:tcBorders>
+            <w:shd w:fill="DCE8E1" w:color="auto" w:val="clear"/>
+            <w:tcMar>
+              <w:top w:type="dxa" w:w="60"/>
+              <w:left w:type="dxa" w:w="100"/>
+              <w:bottom w:type="dxa" w:w="60"/>
+              <w:right w:type="dxa" w:w="100"/>
+            </w:tcMar>
+          </w:tcPr>
+          <w:p>
+            <w:pPr>
+              <w:spacing w:after="0" w:line="260"/>
+            </w:pPr>
+            <w:r>
+              <w:rPr>
+                <w:rFonts w:ascii="Arial" w:cs="Arial" w:eastAsia="Arial" w:hAnsi="Arial"/>
+                <w:b/>
+                <w:bCs/>
+              </w:rPr>
+              <w:t xml:space="preserve">Qué muestra</w:t>
+            </w:r>
+          </w:p>
+        </w:tc>
+        <w:tc>
+          <w:tcPr>
+            <w:tcW w:type="dxa" w:w="1700"/>
+            <w:tcBorders>
+              <w:top w:val="single" w:color="B8C4BE" w:sz="4"/>
+              <w:left w:val="single" w:color="B8C4BE" w:sz="4"/>
+              <w:bottom w:val="single" w:color="B8C4BE" w:sz="4"/>
+              <w:right w:val="single" w:color="B8C4BE" w:sz="4"/>
+            </w:tcBorders>
+            <w:shd w:fill="DCE8E1" w:color="auto" w:val="clear"/>
+            <w:tcMar>
+              <w:top w:type="dxa" w:w="60"/>
+              <w:left w:type="dxa" w:w="100"/>
+              <w:bottom w:type="dxa" w:w="60"/>
+              <w:right w:type="dxa" w:w="100"/>
+            </w:tcMar>
+          </w:tcPr>
+          <w:p>
+            <w:pPr>
+              <w:spacing w:after="0" w:line="260"/>
+            </w:pPr>
+            <w:r>
+              <w:rPr>
+                <w:rFonts w:ascii="Arial" w:cs="Arial" w:eastAsia="Arial" w:hAnsi="Arial"/>
+                <w:b/>
+                <w:bCs/>
+              </w:rPr>
+              <w:t xml:space="preserve">Requisito</w:t>
+            </w:r>
+          </w:p>
+        </w:tc>
+      </w:tr>
+      <w:tr>
+        <w:trPr>
+          <w:tblHeader w:val="false"/>
+        </w:trPr>
+        <w:tc>
+          <w:tcPr>
+            <w:tcW w:type="dxa" w:w="3200"/>
+            <w:tcBorders>
+              <w:top w:val="single" w:color="B8C4BE" w:sz="4"/>
+              <w:left w:val="single" w:color="B8C4BE" w:sz="4"/>
+              <w:bottom w:val="single" w:color="B8C4BE" w:sz="4"/>
+              <w:right w:val="single" w:color="B8C4BE" w:sz="4"/>
+            </w:tcBorders>
+            <w:tcMar>
+              <w:top w:type="dxa" w:w="60"/>
+              <w:left w:type="dxa" w:w="100"/>
+              <w:bottom w:type="dxa" w:w="60"/>
+              <w:right w:type="dxa" w:w="100"/>
+            </w:tcMar>
+          </w:tcPr>
+          <w:p>
+            <w:pPr>
+              <w:spacing w:after="0" w:line="260"/>
+            </w:pPr>
+            <w:r>
+              <w:rPr>
+                <w:rFonts w:ascii="Consolas" w:cs="Consolas" w:eastAsia="Consolas" w:hAnsi="Consolas"/>
                 <w:sz w:val="20"/>
                 <w:szCs w:val="20"/>
               </w:rPr>
-              <w:t xml:space="preserve">Mapa con semáforo: Costa 1 verde, Costa 2 rojo, Monte A gris</w:t>
+              <w:t xml:space="preserve">01_mapa_semaforo</w:t>
+            </w:r>
+          </w:p>
+        </w:tc>
+        <w:tc>
+          <w:tcPr>
+            <w:tcW w:type="dxa" w:w="4100"/>
+            <w:tcBorders>
+              <w:top w:val="single" w:color="B8C4BE" w:sz="4"/>
+              <w:left w:val="single" w:color="B8C4BE" w:sz="4"/>
+              <w:bottom w:val="single" w:color="B8C4BE" w:sz="4"/>
+              <w:right w:val="single" w:color="B8C4BE" w:sz="4"/>
+            </w:tcBorders>
+            <w:tcMar>
+              <w:top w:type="dxa" w:w="60"/>
+              <w:left w:type="dxa" w:w="100"/>
+              <w:bottom w:type="dxa" w:w="60"/>
+              <w:right w:type="dxa" w:w="100"/>
+            </w:tcMar>
+          </w:tcPr>
+          <w:p>
+            <w:pPr>
+              <w:spacing w:after="0" w:line="260"/>
+            </w:pPr>
+            <w:r>
+              <w:rPr>
+                <w:rFonts w:ascii="Arial" w:cs="Arial" w:eastAsia="Arial" w:hAnsi="Arial"/>
+              </w:rPr>
+              <w:t xml:space="preserve">Mapa de Concordia: Costa 1 verde, Costa 2 rojo, Monte A gris</w:t>
+            </w:r>
+          </w:p>
+        </w:tc>
+        <w:tc>
+          <w:tcPr>
+            <w:tcW w:type="dxa" w:w="1700"/>
+            <w:tcBorders>
+              <w:top w:val="single" w:color="B8C4BE" w:sz="4"/>
+              <w:left w:val="single" w:color="B8C4BE" w:sz="4"/>
+              <w:bottom w:val="single" w:color="B8C4BE" w:sz="4"/>
+              <w:right w:val="single" w:color="B8C4BE" w:sz="4"/>
+            </w:tcBorders>
+            <w:tcMar>
+              <w:top w:type="dxa" w:w="60"/>
+              <w:left w:type="dxa" w:w="100"/>
+              <w:bottom w:type="dxa" w:w="60"/>
+              <w:right w:type="dxa" w:w="100"/>
+            </w:tcMar>
+          </w:tcPr>
+          <w:p>
+            <w:pPr>
+              <w:spacing w:after="0" w:line="260"/>
+            </w:pPr>
+            <w:r>
+              <w:rPr>
+                <w:rFonts w:ascii="Arial" w:cs="Arial" w:eastAsia="Arial" w:hAnsi="Arial"/>
+              </w:rPr>
+              <w:t xml:space="preserve">RF-05, RF-12</w:t>
+            </w:r>
+          </w:p>
+        </w:tc>
+      </w:tr>
+      <w:tr>
+        <w:trPr>
+          <w:tblHeader w:val="false"/>
+        </w:trPr>
+        <w:tc>
+          <w:tcPr>
+            <w:tcW w:type="dxa" w:w="3200"/>
+            <w:tcBorders>
+              <w:top w:val="single" w:color="B8C4BE" w:sz="4"/>
+              <w:left w:val="single" w:color="B8C4BE" w:sz="4"/>
+              <w:bottom w:val="single" w:color="B8C4BE" w:sz="4"/>
+              <w:right w:val="single" w:color="B8C4BE" w:sz="4"/>
+            </w:tcBorders>
+            <w:tcMar>
+              <w:top w:type="dxa" w:w="60"/>
+              <w:left w:type="dxa" w:w="100"/>
+              <w:bottom w:type="dxa" w:w="60"/>
+              <w:right w:type="dxa" w:w="100"/>
+            </w:tcMar>
+          </w:tcPr>
+          <w:p>
+            <w:pPr>
+              <w:spacing w:after="0" w:line="260"/>
+            </w:pPr>
+            <w:r>
+              <w:rPr>
+                <w:rFonts w:ascii="Consolas" w:cs="Consolas" w:eastAsia="Consolas" w:hAnsi="Consolas"/>
+                <w:sz w:val="20"/>
+                <w:szCs w:val="20"/>
+              </w:rPr>
+              <w:t xml:space="preserve">02_detalle_costa2</w:t>
+            </w:r>
+          </w:p>
+        </w:tc>
+        <w:tc>
+          <w:tcPr>
+            <w:tcW w:type="dxa" w:w="4100"/>
+            <w:tcBorders>
+              <w:top w:val="single" w:color="B8C4BE" w:sz="4"/>
+              <w:left w:val="single" w:color="B8C4BE" w:sz="4"/>
+              <w:bottom w:val="single" w:color="B8C4BE" w:sz="4"/>
+              <w:right w:val="single" w:color="B8C4BE" w:sz="4"/>
+            </w:tcBorders>
+            <w:tcMar>
+              <w:top w:type="dxa" w:w="60"/>
+              <w:left w:type="dxa" w:w="100"/>
+              <w:bottom w:type="dxa" w:w="60"/>
+              <w:right w:type="dxa" w:w="100"/>
+            </w:tcMar>
+          </w:tcPr>
+          <w:p>
+            <w:pPr>
+              <w:spacing w:after="0" w:line="260"/>
+            </w:pPr>
+            <w:r>
+              <w:rPr>
+                <w:rFonts w:ascii="Arial" w:cs="Arial" w:eastAsia="Arial" w:hAnsi="Arial"/>
+              </w:rPr>
+              <w:t xml:space="preserve">Humedad bajo el umbral, última lectura y gráfico de 6 h</w:t>
+            </w:r>
+          </w:p>
+        </w:tc>
+        <w:tc>
+          <w:tcPr>
+            <w:tcW w:type="dxa" w:w="1700"/>
+            <w:tcBorders>
+              <w:top w:val="single" w:color="B8C4BE" w:sz="4"/>
+              <w:left w:val="single" w:color="B8C4BE" w:sz="4"/>
+              <w:bottom w:val="single" w:color="B8C4BE" w:sz="4"/>
+              <w:right w:val="single" w:color="B8C4BE" w:sz="4"/>
+            </w:tcBorders>
+            <w:tcMar>
+              <w:top w:type="dxa" w:w="60"/>
+              <w:left w:type="dxa" w:w="100"/>
+              <w:bottom w:type="dxa" w:w="60"/>
+              <w:right w:type="dxa" w:w="100"/>
+            </w:tcMar>
+          </w:tcPr>
+          <w:p>
+            <w:pPr>
+              <w:spacing w:after="0" w:line="260"/>
+            </w:pPr>
+            <w:r>
+              <w:rPr>
+                <w:rFonts w:ascii="Arial" w:cs="Arial" w:eastAsia="Arial" w:hAnsi="Arial"/>
+              </w:rPr>
+              <w:t xml:space="preserve">RF-09, RF-10</w:t>
+            </w:r>
+          </w:p>
+        </w:tc>
+      </w:tr>
+      <w:tr>
+        <w:trPr>
+          <w:tblHeader w:val="false"/>
+        </w:trPr>
+        <w:tc>
+          <w:tcPr>
+            <w:tcW w:type="dxa" w:w="3200"/>
+            <w:tcBorders>
+              <w:top w:val="single" w:color="B8C4BE" w:sz="4"/>
+              <w:left w:val="single" w:color="B8C4BE" w:sz="4"/>
+              <w:bottom w:val="single" w:color="B8C4BE" w:sz="4"/>
+              <w:right w:val="single" w:color="B8C4BE" w:sz="4"/>
+            </w:tcBorders>
+            <w:tcMar>
+              <w:top w:type="dxa" w:w="60"/>
+              <w:left w:type="dxa" w:w="100"/>
+              <w:bottom w:type="dxa" w:w="60"/>
+              <w:right w:type="dxa" w:w="100"/>
+            </w:tcMar>
+          </w:tcPr>
+          <w:p>
+            <w:pPr>
+              <w:spacing w:after="0" w:line="260"/>
+            </w:pPr>
+            <w:r>
+              <w:rPr>
+                <w:rFonts w:ascii="Consolas" w:cs="Consolas" w:eastAsia="Consolas" w:hAnsi="Consolas"/>
+                <w:sz w:val="20"/>
+                <w:szCs w:val="20"/>
+              </w:rPr>
+              <w:t xml:space="preserve">03_confirmar_orden</w:t>
+            </w:r>
+          </w:p>
+        </w:tc>
+        <w:tc>
+          <w:tcPr>
+            <w:tcW w:type="dxa" w:w="4100"/>
+            <w:tcBorders>
+              <w:top w:val="single" w:color="B8C4BE" w:sz="4"/>
+              <w:left w:val="single" w:color="B8C4BE" w:sz="4"/>
+              <w:bottom w:val="single" w:color="B8C4BE" w:sz="4"/>
+              <w:right w:val="single" w:color="B8C4BE" w:sz="4"/>
+            </w:tcBorders>
+            <w:tcMar>
+              <w:top w:type="dxa" w:w="60"/>
+              <w:left w:type="dxa" w:w="100"/>
+              <w:bottom w:type="dxa" w:w="60"/>
+              <w:right w:type="dxa" w:w="100"/>
+            </w:tcMar>
+          </w:tcPr>
+          <w:p>
+            <w:pPr>
+              <w:spacing w:after="0" w:line="260"/>
+            </w:pPr>
+            <w:r>
+              <w:rPr>
+                <w:rFonts w:ascii="Arial" w:cs="Arial" w:eastAsia="Arial" w:hAnsi="Arial"/>
+              </w:rPr>
+              <w:t xml:space="preserve">Resumen de la orden con su client_request_id</w:t>
+            </w:r>
+          </w:p>
+        </w:tc>
+        <w:tc>
+          <w:tcPr>
+            <w:tcW w:type="dxa" w:w="1700"/>
+            <w:tcBorders>
+              <w:top w:val="single" w:color="B8C4BE" w:sz="4"/>
+              <w:left w:val="single" w:color="B8C4BE" w:sz="4"/>
+              <w:bottom w:val="single" w:color="B8C4BE" w:sz="4"/>
+              <w:right w:val="single" w:color="B8C4BE" w:sz="4"/>
+            </w:tcBorders>
+            <w:tcMar>
+              <w:top w:type="dxa" w:w="60"/>
+              <w:left w:type="dxa" w:w="100"/>
+              <w:bottom w:type="dxa" w:w="60"/>
+              <w:right w:type="dxa" w:w="100"/>
+            </w:tcMar>
+          </w:tcPr>
+          <w:p>
+            <w:pPr>
+              <w:spacing w:after="0" w:line="260"/>
+            </w:pPr>
+            <w:r>
+              <w:rPr>
+                <w:rFonts w:ascii="Arial" w:cs="Arial" w:eastAsia="Arial" w:hAnsi="Arial"/>
+              </w:rPr>
+              <w:t xml:space="preserve">RF-14</w:t>
+            </w:r>
+          </w:p>
+        </w:tc>
+      </w:tr>
+      <w:tr>
+        <w:trPr>
+          <w:tblHeader w:val="false"/>
+        </w:trPr>
+        <w:tc>
+          <w:tcPr>
+            <w:tcW w:type="dxa" w:w="3200"/>
+            <w:tcBorders>
+              <w:top w:val="single" w:color="B8C4BE" w:sz="4"/>
+              <w:left w:val="single" w:color="B8C4BE" w:sz="4"/>
+              <w:bottom w:val="single" w:color="B8C4BE" w:sz="4"/>
+              <w:right w:val="single" w:color="B8C4BE" w:sz="4"/>
+            </w:tcBorders>
+            <w:tcMar>
+              <w:top w:type="dxa" w:w="60"/>
+              <w:left w:type="dxa" w:w="100"/>
+              <w:bottom w:type="dxa" w:w="60"/>
+              <w:right w:type="dxa" w:w="100"/>
+            </w:tcMar>
+          </w:tcPr>
+          <w:p>
+            <w:pPr>
+              <w:spacing w:after="0" w:line="260"/>
+            </w:pPr>
+            <w:r>
+              <w:rPr>
+                <w:rFonts w:ascii="Consolas" w:cs="Consolas" w:eastAsia="Consolas" w:hAnsi="Consolas"/>
+                <w:sz w:val="20"/>
+                <w:szCs w:val="20"/>
+              </w:rPr>
+              <w:t xml:space="preserve">04_orden_aplicada</w:t>
+            </w:r>
+          </w:p>
+        </w:tc>
+        <w:tc>
+          <w:tcPr>
+            <w:tcW w:type="dxa" w:w="4100"/>
+            <w:tcBorders>
+              <w:top w:val="single" w:color="B8C4BE" w:sz="4"/>
+              <w:left w:val="single" w:color="B8C4BE" w:sz="4"/>
+              <w:bottom w:val="single" w:color="B8C4BE" w:sz="4"/>
+              <w:right w:val="single" w:color="B8C4BE" w:sz="4"/>
+            </w:tcBorders>
+            <w:tcMar>
+              <w:top w:type="dxa" w:w="60"/>
+              <w:left w:type="dxa" w:w="100"/>
+              <w:bottom w:type="dxa" w:w="60"/>
+              <w:right w:type="dxa" w:w="100"/>
+            </w:tcMar>
+          </w:tcPr>
+          <w:p>
+            <w:pPr>
+              <w:spacing w:after="0" w:line="260"/>
+            </w:pPr>
+            <w:r>
+              <w:rPr>
+                <w:rFonts w:ascii="Arial" w:cs="Arial" w:eastAsia="Arial" w:hAnsi="Arial"/>
+              </w:rPr>
+              <w:t xml:space="preserve">Estado "Aplicado", válvula abierta y cierre programado</w:t>
+            </w:r>
+          </w:p>
+        </w:tc>
+        <w:tc>
+          <w:tcPr>
+            <w:tcW w:type="dxa" w:w="1700"/>
+            <w:tcBorders>
+              <w:top w:val="single" w:color="B8C4BE" w:sz="4"/>
+              <w:left w:val="single" w:color="B8C4BE" w:sz="4"/>
+              <w:bottom w:val="single" w:color="B8C4BE" w:sz="4"/>
+              <w:right w:val="single" w:color="B8C4BE" w:sz="4"/>
+            </w:tcBorders>
+            <w:tcMar>
+              <w:top w:type="dxa" w:w="60"/>
+              <w:left w:type="dxa" w:w="100"/>
+              <w:bottom w:type="dxa" w:w="60"/>
+              <w:right w:type="dxa" w:w="100"/>
+            </w:tcMar>
+          </w:tcPr>
+          <w:p>
+            <w:pPr>
+              <w:spacing w:after="0" w:line="260"/>
+            </w:pPr>
+            <w:r>
+              <w:rPr>
+                <w:rFonts w:ascii="Arial" w:cs="Arial" w:eastAsia="Arial" w:hAnsi="Arial"/>
+              </w:rPr>
+              <w:t xml:space="preserve">H1, RF-15</w:t>
+            </w:r>
+          </w:p>
+        </w:tc>
+      </w:tr>
+      <w:tr>
+        <w:trPr>
+          <w:tblHeader w:val="false"/>
+        </w:trPr>
+        <w:tc>
+          <w:tcPr>
+            <w:tcW w:type="dxa" w:w="3200"/>
+            <w:tcBorders>
+              <w:top w:val="single" w:color="B8C4BE" w:sz="4"/>
+              <w:left w:val="single" w:color="B8C4BE" w:sz="4"/>
+              <w:bottom w:val="single" w:color="B8C4BE" w:sz="4"/>
+              <w:right w:val="single" w:color="B8C4BE" w:sz="4"/>
+            </w:tcBorders>
+            <w:tcMar>
+              <w:top w:type="dxa" w:w="60"/>
+              <w:left w:type="dxa" w:w="100"/>
+              <w:bottom w:type="dxa" w:w="60"/>
+              <w:right w:type="dxa" w:w="100"/>
+            </w:tcMar>
+          </w:tcPr>
+          <w:p>
+            <w:pPr>
+              <w:spacing w:after="0" w:line="260"/>
+            </w:pPr>
+            <w:r>
+              <w:rPr>
+                <w:rFonts w:ascii="Consolas" w:cs="Consolas" w:eastAsia="Consolas" w:hAnsi="Consolas"/>
+                <w:sz w:val="20"/>
+                <w:szCs w:val="20"/>
+              </w:rPr>
+              <w:t xml:space="preserve">05_asesor_sin_controles</w:t>
+            </w:r>
+          </w:p>
+        </w:tc>
+        <w:tc>
+          <w:tcPr>
+            <w:tcW w:type="dxa" w:w="4100"/>
+            <w:tcBorders>
+              <w:top w:val="single" w:color="B8C4BE" w:sz="4"/>
+              <w:left w:val="single" w:color="B8C4BE" w:sz="4"/>
+              <w:bottom w:val="single" w:color="B8C4BE" w:sz="4"/>
+              <w:right w:val="single" w:color="B8C4BE" w:sz="4"/>
+            </w:tcBorders>
+            <w:tcMar>
+              <w:top w:type="dxa" w:w="60"/>
+              <w:left w:type="dxa" w:w="100"/>
+              <w:bottom w:type="dxa" w:w="60"/>
+              <w:right w:type="dxa" w:w="100"/>
+            </w:tcMar>
+          </w:tcPr>
+          <w:p>
+            <w:pPr>
+              <w:spacing w:after="0" w:line="260"/>
+            </w:pPr>
+            <w:r>
+              <w:rPr>
+                <w:rFonts w:ascii="Arial" w:cs="Arial" w:eastAsia="Arial" w:hAnsi="Arial"/>
+              </w:rPr>
+              <w:t xml:space="preserve">Rol asesor: mismos colores, riego deshabilitado</w:t>
+            </w:r>
+          </w:p>
+        </w:tc>
+        <w:tc>
+          <w:tcPr>
+            <w:tcW w:type="dxa" w:w="1700"/>
+            <w:tcBorders>
+              <w:top w:val="single" w:color="B8C4BE" w:sz="4"/>
+              <w:left w:val="single" w:color="B8C4BE" w:sz="4"/>
+              <w:bottom w:val="single" w:color="B8C4BE" w:sz="4"/>
+              <w:right w:val="single" w:color="B8C4BE" w:sz="4"/>
+            </w:tcBorders>
+            <w:tcMar>
+              <w:top w:type="dxa" w:w="60"/>
+              <w:left w:type="dxa" w:w="100"/>
+              <w:bottom w:type="dxa" w:w="60"/>
+              <w:right w:type="dxa" w:w="100"/>
+            </w:tcMar>
+          </w:tcPr>
+          <w:p>
+            <w:pPr>
+              <w:spacing w:after="0" w:line="260"/>
+            </w:pPr>
+            <w:r>
+              <w:rPr>
+                <w:rFonts w:ascii="Arial" w:cs="Arial" w:eastAsia="Arial" w:hAnsi="Arial"/>
+              </w:rPr>
+              <w:t xml:space="preserve">H2</w:t>
+            </w:r>
+          </w:p>
+        </w:tc>
+      </w:tr>
+      <w:tr>
+        <w:trPr>
+          <w:tblHeader w:val="false"/>
+        </w:trPr>
+        <w:tc>
+          <w:tcPr>
+            <w:tcW w:type="dxa" w:w="3200"/>
+            <w:tcBorders>
+              <w:top w:val="single" w:color="B8C4BE" w:sz="4"/>
+              <w:left w:val="single" w:color="B8C4BE" w:sz="4"/>
+              <w:bottom w:val="single" w:color="B8C4BE" w:sz="4"/>
+              <w:right w:val="single" w:color="B8C4BE" w:sz="4"/>
+            </w:tcBorders>
+            <w:tcMar>
+              <w:top w:type="dxa" w:w="60"/>
+              <w:left w:type="dxa" w:w="100"/>
+              <w:bottom w:type="dxa" w:w="60"/>
+              <w:right w:type="dxa" w:w="100"/>
+            </w:tcMar>
+          </w:tcPr>
+          <w:p>
+            <w:pPr>
+              <w:spacing w:after="0" w:line="260"/>
+            </w:pPr>
+            <w:r>
+              <w:rPr>
+                <w:rFonts w:ascii="Consolas" w:cs="Consolas" w:eastAsia="Consolas" w:hAnsi="Consolas"/>
+                <w:sz w:val="20"/>
+                <w:szCs w:val="20"/>
+              </w:rPr>
+              <w:t xml:space="preserve">06_rechazo_pendiente</w:t>
+            </w:r>
+          </w:p>
+        </w:tc>
+        <w:tc>
+          <w:tcPr>
+            <w:tcW w:type="dxa" w:w="4100"/>
+            <w:tcBorders>
+              <w:top w:val="single" w:color="B8C4BE" w:sz="4"/>
+              <w:left w:val="single" w:color="B8C4BE" w:sz="4"/>
+              <w:bottom w:val="single" w:color="B8C4BE" w:sz="4"/>
+              <w:right w:val="single" w:color="B8C4BE" w:sz="4"/>
+            </w:tcBorders>
+            <w:tcMar>
+              <w:top w:type="dxa" w:w="60"/>
+              <w:left w:type="dxa" w:w="100"/>
+              <w:bottom w:type="dxa" w:w="60"/>
+              <w:right w:type="dxa" w:w="100"/>
+            </w:tcMar>
+          </w:tcPr>
+          <w:p>
+            <w:pPr>
+              <w:spacing w:after="0" w:line="260"/>
+            </w:pPr>
+            <w:r>
+              <w:rPr>
+                <w:rFonts w:ascii="Arial" w:cs="Arial" w:eastAsia="Arial" w:hAnsi="Arial"/>
+              </w:rPr>
+              <w:t xml:space="preserve">Segunda orden rechazada: "ya tiene una orden pendiente"</w:t>
+            </w:r>
+          </w:p>
+        </w:tc>
+        <w:tc>
+          <w:tcPr>
+            <w:tcW w:type="dxa" w:w="1700"/>
+            <w:tcBorders>
+              <w:top w:val="single" w:color="B8C4BE" w:sz="4"/>
+              <w:left w:val="single" w:color="B8C4BE" w:sz="4"/>
+              <w:bottom w:val="single" w:color="B8C4BE" w:sz="4"/>
+              <w:right w:val="single" w:color="B8C4BE" w:sz="4"/>
+            </w:tcBorders>
+            <w:tcMar>
+              <w:top w:type="dxa" w:w="60"/>
+              <w:left w:type="dxa" w:w="100"/>
+              <w:bottom w:type="dxa" w:w="60"/>
+              <w:right w:type="dxa" w:w="100"/>
+            </w:tcMar>
+          </w:tcPr>
+          <w:p>
+            <w:pPr>
+              <w:spacing w:after="0" w:line="260"/>
+            </w:pPr>
+            <w:r>
+              <w:rPr>
+                <w:rFonts w:ascii="Arial" w:cs="Arial" w:eastAsia="Arial" w:hAnsi="Arial"/>
+              </w:rPr>
+              <w:t xml:space="preserve">RF-16</w:t>
+            </w:r>
+          </w:p>
+        </w:tc>
+      </w:tr>
+      <w:tr>
+        <w:trPr>
+          <w:tblHeader w:val="false"/>
+        </w:trPr>
+        <w:tc>
+          <w:tcPr>
+            <w:tcW w:type="dxa" w:w="3200"/>
+            <w:tcBorders>
+              <w:top w:val="single" w:color="B8C4BE" w:sz="4"/>
+              <w:left w:val="single" w:color="B8C4BE" w:sz="4"/>
+              <w:bottom w:val="single" w:color="B8C4BE" w:sz="4"/>
+              <w:right w:val="single" w:color="B8C4BE" w:sz="4"/>
+            </w:tcBorders>
+            <w:tcMar>
+              <w:top w:type="dxa" w:w="60"/>
+              <w:left w:type="dxa" w:w="100"/>
+              <w:bottom w:type="dxa" w:w="60"/>
+              <w:right w:type="dxa" w:w="100"/>
+            </w:tcMar>
+          </w:tcPr>
+          <w:p>
+            <w:pPr>
+              <w:spacing w:after="0" w:line="260"/>
+            </w:pPr>
+            <w:r>
+              <w:rPr>
+                <w:rFonts w:ascii="Consolas" w:cs="Consolas" w:eastAsia="Consolas" w:hAnsi="Consolas"/>
+                <w:sz w:val="20"/>
+                <w:szCs w:val="20"/>
+              </w:rPr>
+              <w:t xml:space="preserve">07_monte_a_stale</w:t>
+            </w:r>
+          </w:p>
+        </w:tc>
+        <w:tc>
+          <w:tcPr>
+            <w:tcW w:type="dxa" w:w="4100"/>
+            <w:tcBorders>
+              <w:top w:val="single" w:color="B8C4BE" w:sz="4"/>
+              <w:left w:val="single" w:color="B8C4BE" w:sz="4"/>
+              <w:bottom w:val="single" w:color="B8C4BE" w:sz="4"/>
+              <w:right w:val="single" w:color="B8C4BE" w:sz="4"/>
+            </w:tcBorders>
+            <w:tcMar>
+              <w:top w:type="dxa" w:w="60"/>
+              <w:left w:type="dxa" w:w="100"/>
+              <w:bottom w:type="dxa" w:w="60"/>
+              <w:right w:type="dxa" w:w="100"/>
+            </w:tcMar>
+          </w:tcPr>
+          <w:p>
+            <w:pPr>
+              <w:spacing w:after="0" w:line="260"/>
+            </w:pPr>
+            <w:r>
+              <w:rPr>
+                <w:rFonts w:ascii="Arial" w:cs="Arial" w:eastAsia="Arial" w:hAnsi="Arial"/>
+              </w:rPr>
+              <w:t xml:space="preserve">Lote sin ticks en gris, no en rojo</w:t>
+            </w:r>
+          </w:p>
+        </w:tc>
+        <w:tc>
+          <w:tcPr>
+            <w:tcW w:type="dxa" w:w="1700"/>
+            <w:tcBorders>
+              <w:top w:val="single" w:color="B8C4BE" w:sz="4"/>
+              <w:left w:val="single" w:color="B8C4BE" w:sz="4"/>
+              <w:bottom w:val="single" w:color="B8C4BE" w:sz="4"/>
+              <w:right w:val="single" w:color="B8C4BE" w:sz="4"/>
+            </w:tcBorders>
+            <w:tcMar>
+              <w:top w:type="dxa" w:w="60"/>
+              <w:left w:type="dxa" w:w="100"/>
+              <w:bottom w:type="dxa" w:w="60"/>
+              <w:right w:type="dxa" w:w="100"/>
+            </w:tcMar>
+          </w:tcPr>
+          <w:p>
+            <w:pPr>
+              <w:spacing w:after="0" w:line="260"/>
+            </w:pPr>
+            <w:r>
+              <w:rPr>
+                <w:rFonts w:ascii="Arial" w:cs="Arial" w:eastAsia="Arial" w:hAnsi="Arial"/>
+              </w:rPr>
+              <w:t xml:space="preserve">H4, RF-09</w:t>
+            </w:r>
+          </w:p>
+        </w:tc>
+      </w:tr>
+      <w:tr>
+        <w:trPr>
+          <w:tblHeader w:val="false"/>
+        </w:trPr>
+        <w:tc>
+          <w:tcPr>
+            <w:tcW w:type="dxa" w:w="3200"/>
+            <w:tcBorders>
+              <w:top w:val="single" w:color="B8C4BE" w:sz="4"/>
+              <w:left w:val="single" w:color="B8C4BE" w:sz="4"/>
+              <w:bottom w:val="single" w:color="B8C4BE" w:sz="4"/>
+              <w:right w:val="single" w:color="B8C4BE" w:sz="4"/>
+            </w:tcBorders>
+            <w:tcMar>
+              <w:top w:type="dxa" w:w="60"/>
+              <w:left w:type="dxa" w:w="100"/>
+              <w:bottom w:type="dxa" w:w="60"/>
+              <w:right w:type="dxa" w:w="100"/>
+            </w:tcMar>
+          </w:tcPr>
+          <w:p>
+            <w:pPr>
+              <w:spacing w:after="0" w:line="260"/>
+            </w:pPr>
+            <w:r>
+              <w:rPr>
+                <w:rFonts w:ascii="Consolas" w:cs="Consolas" w:eastAsia="Consolas" w:hAnsi="Consolas"/>
+                <w:sz w:val="20"/>
+                <w:szCs w:val="20"/>
+              </w:rPr>
+              <w:t xml:space="preserve">08_diagnostico</w:t>
+            </w:r>
+          </w:p>
+        </w:tc>
+        <w:tc>
+          <w:tcPr>
+            <w:tcW w:type="dxa" w:w="4100"/>
+            <w:tcBorders>
+              <w:top w:val="single" w:color="B8C4BE" w:sz="4"/>
+              <w:left w:val="single" w:color="B8C4BE" w:sz="4"/>
+              <w:bottom w:val="single" w:color="B8C4BE" w:sz="4"/>
+              <w:right w:val="single" w:color="B8C4BE" w:sz="4"/>
+            </w:tcBorders>
+            <w:tcMar>
+              <w:top w:type="dxa" w:w="60"/>
+              <w:left w:type="dxa" w:w="100"/>
+              <w:bottom w:type="dxa" w:w="60"/>
+              <w:right w:type="dxa" w:w="100"/>
+            </w:tcMar>
+          </w:tcPr>
+          <w:p>
+            <w:pPr>
+              <w:spacing w:after="0" w:line="260"/>
+            </w:pPr>
+            <w:r>
+              <w:rPr>
+                <w:rFonts w:ascii="Arial" w:cs="Arial" w:eastAsia="Arial" w:hAnsi="Arial"/>
+              </w:rPr>
+              <w:t xml:space="preserve">Usuario, establecimiento, último evento y lag aparente</w:t>
+            </w:r>
+          </w:p>
+        </w:tc>
+        <w:tc>
+          <w:tcPr>
+            <w:tcW w:type="dxa" w:w="1700"/>
+            <w:tcBorders>
+              <w:top w:val="single" w:color="B8C4BE" w:sz="4"/>
+              <w:left w:val="single" w:color="B8C4BE" w:sz="4"/>
+              <w:bottom w:val="single" w:color="B8C4BE" w:sz="4"/>
+              <w:right w:val="single" w:color="B8C4BE" w:sz="4"/>
+            </w:tcBorders>
+            <w:tcMar>
+              <w:top w:type="dxa" w:w="60"/>
+              <w:left w:type="dxa" w:w="100"/>
+              <w:bottom w:type="dxa" w:w="60"/>
+              <w:right w:type="dxa" w:w="100"/>
+            </w:tcMar>
+          </w:tcPr>
+          <w:p>
+            <w:pPr>
+              <w:spacing w:after="0" w:line="260"/>
+            </w:pPr>
+            <w:r>
+              <w:rPr>
+                <w:rFonts w:ascii="Arial" w:cs="Arial" w:eastAsia="Arial" w:hAnsi="Arial"/>
+              </w:rPr>
+              <w:t xml:space="preserve">RF-23</w:t>
+            </w:r>
+          </w:p>
+        </w:tc>
+      </w:tr>
+      <w:tr>
+        <w:trPr>
+          <w:tblHeader w:val="false"/>
+        </w:trPr>
+        <w:tc>
+          <w:tcPr>
+            <w:tcW w:type="dxa" w:w="3200"/>
+            <w:tcBorders>
+              <w:top w:val="single" w:color="B8C4BE" w:sz="4"/>
+              <w:left w:val="single" w:color="B8C4BE" w:sz="4"/>
+              <w:bottom w:val="single" w:color="B8C4BE" w:sz="4"/>
+              <w:right w:val="single" w:color="B8C4BE" w:sz="4"/>
+            </w:tcBorders>
+            <w:tcMar>
+              <w:top w:type="dxa" w:w="60"/>
+              <w:left w:type="dxa" w:w="100"/>
+              <w:bottom w:type="dxa" w:w="60"/>
+              <w:right w:type="dxa" w:w="100"/>
+            </w:tcMar>
+          </w:tcPr>
+          <w:p>
+            <w:pPr>
+              <w:spacing w:after="0" w:line="260"/>
+            </w:pPr>
+            <w:r>
+              <w:rPr>
+                <w:rFonts w:ascii="Consolas" w:cs="Consolas" w:eastAsia="Consolas" w:hAnsi="Consolas"/>
+                <w:sz w:val="20"/>
+                <w:szCs w:val="20"/>
+              </w:rPr>
+              <w:t xml:space="preserve">09_logs_docker</w:t>
+            </w:r>
+          </w:p>
+        </w:tc>
+        <w:tc>
+          <w:tcPr>
+            <w:tcW w:type="dxa" w:w="4100"/>
+            <w:tcBorders>
+              <w:top w:val="single" w:color="B8C4BE" w:sz="4"/>
+              <w:left w:val="single" w:color="B8C4BE" w:sz="4"/>
+              <w:bottom w:val="single" w:color="B8C4BE" w:sz="4"/>
+              <w:right w:val="single" w:color="B8C4BE" w:sz="4"/>
+            </w:tcBorders>
+            <w:tcMar>
+              <w:top w:type="dxa" w:w="60"/>
+              <w:left w:type="dxa" w:w="100"/>
+              <w:bottom w:type="dxa" w:w="60"/>
+              <w:right w:type="dxa" w:w="100"/>
+            </w:tcMar>
+          </w:tcPr>
+          <w:p>
+            <w:pPr>
+              <w:spacing w:after="0" w:line="260"/>
+            </w:pPr>
+            <w:r>
+              <w:rPr>
+                <w:rFonts w:ascii="Arial" w:cs="Arial" w:eastAsia="Arial" w:hAnsi="Arial"/>
+              </w:rPr>
+              <w:t xml:space="preserve">produced / consumed / upsert reading / [Commands]</w:t>
+            </w:r>
+          </w:p>
+        </w:tc>
+        <w:tc>
+          <w:tcPr>
+            <w:tcW w:type="dxa" w:w="1700"/>
+            <w:tcBorders>
+              <w:top w:val="single" w:color="B8C4BE" w:sz="4"/>
+              <w:left w:val="single" w:color="B8C4BE" w:sz="4"/>
+              <w:bottom w:val="single" w:color="B8C4BE" w:sz="4"/>
+              <w:right w:val="single" w:color="B8C4BE" w:sz="4"/>
+            </w:tcBorders>
+            <w:tcMar>
+              <w:top w:type="dxa" w:w="60"/>
+              <w:left w:type="dxa" w:w="100"/>
+              <w:bottom w:type="dxa" w:w="60"/>
+              <w:right w:type="dxa" w:w="100"/>
+            </w:tcMar>
+          </w:tcPr>
+          <w:p>
+            <w:pPr>
+              <w:spacing w:after="0" w:line="260"/>
+            </w:pPr>
+            <w:r>
+              <w:rPr>
+                <w:rFonts w:ascii="Arial" w:cs="Arial" w:eastAsia="Arial" w:hAnsi="Arial"/>
+              </w:rPr>
+              <w:t xml:space="preserve">RF-24</w:t>
+            </w:r>
+          </w:p>
+        </w:tc>
+      </w:tr>
+      <w:tr>
+        <w:trPr>
+          <w:tblHeader w:val="false"/>
+        </w:trPr>
+        <w:tc>
+          <w:tcPr>
+            <w:tcW w:type="dxa" w:w="3200"/>
+            <w:tcBorders>
+              <w:top w:val="single" w:color="B8C4BE" w:sz="4"/>
+              <w:left w:val="single" w:color="B8C4BE" w:sz="4"/>
+              <w:bottom w:val="single" w:color="B8C4BE" w:sz="4"/>
+              <w:right w:val="single" w:color="B8C4BE" w:sz="4"/>
+            </w:tcBorders>
+            <w:tcMar>
+              <w:top w:type="dxa" w:w="60"/>
+              <w:left w:type="dxa" w:w="100"/>
+              <w:bottom w:type="dxa" w:w="60"/>
+              <w:right w:type="dxa" w:w="100"/>
+            </w:tcMar>
+          </w:tcPr>
+          <w:p>
+            <w:pPr>
+              <w:spacing w:after="0" w:line="260"/>
+            </w:pPr>
+            <w:r>
+              <w:rPr>
+                <w:rFonts w:ascii="Consolas" w:cs="Consolas" w:eastAsia="Consolas" w:hAnsi="Consolas"/>
+                <w:sz w:val="20"/>
+                <w:szCs w:val="20"/>
+              </w:rPr>
+              <w:t xml:space="preserve">video_demo</w:t>
+            </w:r>
+          </w:p>
+        </w:tc>
+        <w:tc>
+          <w:tcPr>
+            <w:tcW w:type="dxa" w:w="4100"/>
+            <w:tcBorders>
+              <w:top w:val="single" w:color="B8C4BE" w:sz="4"/>
+              <w:left w:val="single" w:color="B8C4BE" w:sz="4"/>
+              <w:bottom w:val="single" w:color="B8C4BE" w:sz="4"/>
+              <w:right w:val="single" w:color="B8C4BE" w:sz="4"/>
+            </w:tcBorders>
+            <w:tcMar>
+              <w:top w:type="dxa" w:w="60"/>
+              <w:left w:type="dxa" w:w="100"/>
+              <w:bottom w:type="dxa" w:w="60"/>
+              <w:right w:type="dxa" w:w="100"/>
+            </w:tcMar>
+          </w:tcPr>
+          <w:p>
+            <w:pPr>
+              <w:spacing w:after="0" w:line="260"/>
+            </w:pPr>
+            <w:r>
+              <w:rPr>
+                <w:rFonts w:ascii="Arial" w:cs="Arial" w:eastAsia="Arial" w:hAnsi="Arial"/>
+              </w:rPr>
+              <w:t xml:space="preserve">Recorrido de H1, H2 y RF-16 (3–5 min)</w:t>
+            </w:r>
+          </w:p>
+        </w:tc>
+        <w:tc>
+          <w:tcPr>
+            <w:tcW w:type="dxa" w:w="1700"/>
+            <w:tcBorders>
+              <w:top w:val="single" w:color="B8C4BE" w:sz="4"/>
+              <w:left w:val="single" w:color="B8C4BE" w:sz="4"/>
+              <w:bottom w:val="single" w:color="B8C4BE" w:sz="4"/>
+              <w:right w:val="single" w:color="B8C4BE" w:sz="4"/>
+            </w:tcBorders>
+            <w:tcMar>
+              <w:top w:type="dxa" w:w="60"/>
+              <w:left w:type="dxa" w:w="100"/>
+              <w:bottom w:type="dxa" w:w="60"/>
+              <w:right w:type="dxa" w:w="100"/>
+            </w:tcMar>
+          </w:tcPr>
+          <w:p>
+            <w:pPr>
+              <w:spacing w:after="0" w:line="260"/>
+            </w:pPr>
+            <w:r>
+              <w:rPr>
+                <w:rFonts w:ascii="Arial" w:cs="Arial" w:eastAsia="Arial" w:hAnsi="Arial"/>
+              </w:rPr>
+              <w:t xml:space="preserve">Entregable 5</w:t>
             </w:r>
           </w:p>
         </w:tc>
@@ -4982,323 +5972,7 @@
           <w:sz w:val="18"/>
           <w:szCs w:val="18"/>
         </w:rPr>
-        <w:t xml:space="preserve">Figura 3. Mapa del establecimiento con el estado de cada lote.</w:t>
-      </w:r>
-    </w:p>
-    <w:tbl>
-      <w:tblPr>
-        <w:tblW w:type="dxa" w:w="9000"/>
-        <w:tblBorders>
-          <w:top w:val="single" w:color="auto" w:sz="4"/>
-          <w:left w:val="single" w:color="auto" w:sz="4"/>
-          <w:bottom w:val="single" w:color="auto" w:sz="4"/>
-          <w:right w:val="single" w:color="auto" w:sz="4"/>
-          <w:insideH w:val="single" w:color="auto" w:sz="4"/>
-          <w:insideV w:val="single" w:color="auto" w:sz="4"/>
-        </w:tblBorders>
-      </w:tblPr>
-      <w:tblGrid>
-        <w:gridCol w:w="9000"/>
-      </w:tblGrid>
-      <w:tr>
-        <w:trPr>
-          <w:trHeight w:val="2600" w:hRule="atLeast"/>
-        </w:trPr>
-        <w:tc>
-          <w:tcPr>
-            <w:tcW w:type="dxa" w:w="9000"/>
-            <w:tcBorders>
-              <w:top w:val="dashed" w:color="8FA39A" w:sz="8"/>
-              <w:left w:val="dashed" w:color="8FA39A" w:sz="8"/>
-              <w:bottom w:val="dashed" w:color="8FA39A" w:sz="8"/>
-              <w:right w:val="dashed" w:color="8FA39A" w:sz="8"/>
-            </w:tcBorders>
-            <w:shd w:fill="F4F7F5" w:color="auto" w:val="clear"/>
-            <w:vAlign w:val="center"/>
-          </w:tcPr>
-          <w:p>
-            <w:pPr>
-              <w:jc w:val="center"/>
-            </w:pPr>
-            <w:r>
-              <w:rPr>
-                <w:rFonts w:ascii="Arial" w:cs="Arial" w:eastAsia="Arial" w:hAnsi="Arial"/>
-                <w:b/>
-                <w:bCs/>
-                <w:color w:val="5A6B64"/>
-              </w:rPr>
-              <w:t xml:space="preserve">[ PEGAR CAPTURA ]</w:t>
-            </w:r>
-          </w:p>
-          <w:p>
-            <w:pPr>
-              <w:jc w:val="center"/>
-            </w:pPr>
-            <w:r>
-              <w:rPr>
-                <w:rFonts w:ascii="Arial" w:cs="Arial" w:eastAsia="Arial" w:hAnsi="Arial"/>
-                <w:color w:val="5A6B64"/>
-                <w:sz w:val="20"/>
-                <w:szCs w:val="20"/>
-              </w:rPr>
-              <w:t xml:space="preserve">Detalle de Costa 2: humedad bajo el umbral y gráfico de 6 h</w:t>
-            </w:r>
-          </w:p>
-        </w:tc>
-      </w:tr>
-    </w:tbl>
-    <w:p>
-      <w:pPr>
-        <w:spacing w:after="240" w:before="60"/>
-        <w:jc w:val="center"/>
-      </w:pPr>
-      <w:r>
-        <w:rPr>
-          <w:rFonts w:ascii="Arial" w:cs="Arial" w:eastAsia="Arial" w:hAnsi="Arial"/>
-          <w:i/>
-          <w:iCs/>
-          <w:color w:val="5A6B64"/>
-          <w:sz w:val="18"/>
-          <w:szCs w:val="18"/>
-        </w:rPr>
-        <w:t xml:space="preserve">Figura 4. Detalle del lote con la última lectura y la tendencia.</w:t>
-      </w:r>
-    </w:p>
-    <w:tbl>
-      <w:tblPr>
-        <w:tblW w:type="dxa" w:w="9000"/>
-        <w:tblBorders>
-          <w:top w:val="single" w:color="auto" w:sz="4"/>
-          <w:left w:val="single" w:color="auto" w:sz="4"/>
-          <w:bottom w:val="single" w:color="auto" w:sz="4"/>
-          <w:right w:val="single" w:color="auto" w:sz="4"/>
-          <w:insideH w:val="single" w:color="auto" w:sz="4"/>
-          <w:insideV w:val="single" w:color="auto" w:sz="4"/>
-        </w:tblBorders>
-      </w:tblPr>
-      <w:tblGrid>
-        <w:gridCol w:w="9000"/>
-      </w:tblGrid>
-      <w:tr>
-        <w:trPr>
-          <w:trHeight w:val="2600" w:hRule="atLeast"/>
-        </w:trPr>
-        <w:tc>
-          <w:tcPr>
-            <w:tcW w:type="dxa" w:w="9000"/>
-            <w:tcBorders>
-              <w:top w:val="dashed" w:color="8FA39A" w:sz="8"/>
-              <w:left w:val="dashed" w:color="8FA39A" w:sz="8"/>
-              <w:bottom w:val="dashed" w:color="8FA39A" w:sz="8"/>
-              <w:right w:val="dashed" w:color="8FA39A" w:sz="8"/>
-            </w:tcBorders>
-            <w:shd w:fill="F4F7F5" w:color="auto" w:val="clear"/>
-            <w:vAlign w:val="center"/>
-          </w:tcPr>
-          <w:p>
-            <w:pPr>
-              <w:jc w:val="center"/>
-            </w:pPr>
-            <w:r>
-              <w:rPr>
-                <w:rFonts w:ascii="Arial" w:cs="Arial" w:eastAsia="Arial" w:hAnsi="Arial"/>
-                <w:b/>
-                <w:bCs/>
-                <w:color w:val="5A6B64"/>
-              </w:rPr>
-              <w:t xml:space="preserve">[ PEGAR CAPTURA ]</w:t>
-            </w:r>
-          </w:p>
-          <w:p>
-            <w:pPr>
-              <w:jc w:val="center"/>
-            </w:pPr>
-            <w:r>
-              <w:rPr>
-                <w:rFonts w:ascii="Arial" w:cs="Arial" w:eastAsia="Arial" w:hAnsi="Arial"/>
-                <w:color w:val="5A6B64"/>
-                <w:sz w:val="20"/>
-                <w:szCs w:val="20"/>
-              </w:rPr>
-              <w:t xml:space="preserve">Confirmación de la orden (resumen + client_request_id) y luego estado "Aplicado"</w:t>
-            </w:r>
-          </w:p>
-        </w:tc>
-      </w:tr>
-    </w:tbl>
-    <w:p>
-      <w:pPr>
-        <w:spacing w:after="240" w:before="60"/>
-        <w:jc w:val="center"/>
-      </w:pPr>
-      <w:r>
-        <w:rPr>
-          <w:rFonts w:ascii="Arial" w:cs="Arial" w:eastAsia="Arial" w:hAnsi="Arial"/>
-          <w:i/>
-          <w:iCs/>
-          <w:color w:val="5A6B64"/>
-          <w:sz w:val="18"/>
-          <w:szCs w:val="18"/>
-        </w:rPr>
-        <w:t xml:space="preserve">Figura 5. Orden confirmada y aplicada por el worker.</w:t>
-      </w:r>
-    </w:p>
-    <w:tbl>
-      <w:tblPr>
-        <w:tblW w:type="dxa" w:w="9000"/>
-        <w:tblBorders>
-          <w:top w:val="single" w:color="auto" w:sz="4"/>
-          <w:left w:val="single" w:color="auto" w:sz="4"/>
-          <w:bottom w:val="single" w:color="auto" w:sz="4"/>
-          <w:right w:val="single" w:color="auto" w:sz="4"/>
-          <w:insideH w:val="single" w:color="auto" w:sz="4"/>
-          <w:insideV w:val="single" w:color="auto" w:sz="4"/>
-        </w:tblBorders>
-      </w:tblPr>
-      <w:tblGrid>
-        <w:gridCol w:w="9000"/>
-      </w:tblGrid>
-      <w:tr>
-        <w:trPr>
-          <w:trHeight w:val="2600" w:hRule="atLeast"/>
-        </w:trPr>
-        <w:tc>
-          <w:tcPr>
-            <w:tcW w:type="dxa" w:w="9000"/>
-            <w:tcBorders>
-              <w:top w:val="dashed" w:color="8FA39A" w:sz="8"/>
-              <w:left w:val="dashed" w:color="8FA39A" w:sz="8"/>
-              <w:bottom w:val="dashed" w:color="8FA39A" w:sz="8"/>
-              <w:right w:val="dashed" w:color="8FA39A" w:sz="8"/>
-            </w:tcBorders>
-            <w:shd w:fill="F4F7F5" w:color="auto" w:val="clear"/>
-            <w:vAlign w:val="center"/>
-          </w:tcPr>
-          <w:p>
-            <w:pPr>
-              <w:jc w:val="center"/>
-            </w:pPr>
-            <w:r>
-              <w:rPr>
-                <w:rFonts w:ascii="Arial" w:cs="Arial" w:eastAsia="Arial" w:hAnsi="Arial"/>
-                <w:b/>
-                <w:bCs/>
-                <w:color w:val="5A6B64"/>
-              </w:rPr>
-              <w:t xml:space="preserve">[ PEGAR CAPTURA ]</w:t>
-            </w:r>
-          </w:p>
-          <w:p>
-            <w:pPr>
-              <w:jc w:val="center"/>
-            </w:pPr>
-            <w:r>
-              <w:rPr>
-                <w:rFonts w:ascii="Arial" w:cs="Arial" w:eastAsia="Arial" w:hAnsi="Arial"/>
-                <w:color w:val="5A6B64"/>
-                <w:sz w:val="20"/>
-                <w:szCs w:val="20"/>
-              </w:rPr>
-              <w:t xml:space="preserve">Asesor con controles deshabilitados (H2) · o rechazo RF-16</w:t>
-            </w:r>
-          </w:p>
-        </w:tc>
-      </w:tr>
-    </w:tbl>
-    <w:p>
-      <w:pPr>
-        <w:spacing w:after="240" w:before="60"/>
-        <w:jc w:val="center"/>
-      </w:pPr>
-      <w:r>
-        <w:rPr>
-          <w:rFonts w:ascii="Arial" w:cs="Arial" w:eastAsia="Arial" w:hAnsi="Arial"/>
-          <w:i/>
-          <w:iCs/>
-          <w:color w:val="5A6B64"/>
-          <w:sz w:val="18"/>
-          <w:szCs w:val="18"/>
-        </w:rPr>
-        <w:t xml:space="preserve">Figura 6. Permisos verificados en el servidor.</w:t>
-      </w:r>
-    </w:p>
-    <w:tbl>
-      <w:tblPr>
-        <w:tblW w:type="dxa" w:w="9000"/>
-        <w:tblBorders>
-          <w:top w:val="single" w:color="auto" w:sz="4"/>
-          <w:left w:val="single" w:color="auto" w:sz="4"/>
-          <w:bottom w:val="single" w:color="auto" w:sz="4"/>
-          <w:right w:val="single" w:color="auto" w:sz="4"/>
-          <w:insideH w:val="single" w:color="auto" w:sz="4"/>
-          <w:insideV w:val="single" w:color="auto" w:sz="4"/>
-        </w:tblBorders>
-      </w:tblPr>
-      <w:tblGrid>
-        <w:gridCol w:w="9000"/>
-      </w:tblGrid>
-      <w:tr>
-        <w:trPr>
-          <w:trHeight w:val="2600" w:hRule="atLeast"/>
-        </w:trPr>
-        <w:tc>
-          <w:tcPr>
-            <w:tcW w:type="dxa" w:w="9000"/>
-            <w:tcBorders>
-              <w:top w:val="dashed" w:color="8FA39A" w:sz="8"/>
-              <w:left w:val="dashed" w:color="8FA39A" w:sz="8"/>
-              <w:bottom w:val="dashed" w:color="8FA39A" w:sz="8"/>
-              <w:right w:val="dashed" w:color="8FA39A" w:sz="8"/>
-            </w:tcBorders>
-            <w:shd w:fill="F4F7F5" w:color="auto" w:val="clear"/>
-            <w:vAlign w:val="center"/>
-          </w:tcPr>
-          <w:p>
-            <w:pPr>
-              <w:jc w:val="center"/>
-            </w:pPr>
-            <w:r>
-              <w:rPr>
-                <w:rFonts w:ascii="Arial" w:cs="Arial" w:eastAsia="Arial" w:hAnsi="Arial"/>
-                <w:b/>
-                <w:bCs/>
-                <w:color w:val="5A6B64"/>
-              </w:rPr>
-              <w:t xml:space="preserve">[ PEGAR CAPTURA ]</w:t>
-            </w:r>
-          </w:p>
-          <w:p>
-            <w:pPr>
-              <w:jc w:val="center"/>
-            </w:pPr>
-            <w:r>
-              <w:rPr>
-                <w:rFonts w:ascii="Arial" w:cs="Arial" w:eastAsia="Arial" w:hAnsi="Arial"/>
-                <w:color w:val="5A6B64"/>
-                <w:sz w:val="20"/>
-                <w:szCs w:val="20"/>
-              </w:rPr>
-              <w:t xml:space="preserve">Logs de Docker: produced / consumed / upsert reading / [Commands] applied</w:t>
-            </w:r>
-          </w:p>
-        </w:tc>
-      </w:tr>
-    </w:tbl>
-    <w:p>
-      <w:pPr>
-        <w:spacing w:after="240" w:before="60"/>
-        <w:jc w:val="center"/>
-      </w:pPr>
-      <w:r>
-        <w:rPr>
-          <w:rFonts w:ascii="Arial" w:cs="Arial" w:eastAsia="Arial" w:hAnsi="Arial"/>
-          <w:i/>
-          <w:iCs/>
-          <w:color w:val="5A6B64"/>
-          <w:sz w:val="18"/>
-          <w:szCs w:val="18"/>
-        </w:rPr>
-        <w:t xml:space="preserve">Figura 7. Logs del worker y el simulador (RF-24).</w:t>
+        <w:t xml:space="preserve">Tabla 7. Evidencia entregada en la carpeta de Drive.</w:t>
       </w:r>
     </w:p>
     <w:p>

</xml_diff>

<commit_message>
Informe final y hoja de entrega
</commit_message>
<xml_diff>
--- a/AgroPulse_Informe_TP4.docx
+++ b/AgroPulse_Informe_TP4.docx
@@ -4906,6 +4906,154 @@
         <w:t xml:space="preserve">Historia H1: el productor abre AgroPulse y ve que Costa 2 está en rojo. Entra y ve la humedad por debajo del umbral. Envía "regar" y en menos de 5 s la válvula figura abierta y el comando, aplicado.</w:t>
       </w:r>
     </w:p>
+    <w:tbl>
+      <w:tblPr>
+        <w:tblW w:type="dxa" w:w="9000"/>
+        <w:tblBorders>
+          <w:top w:val="none" w:color="FFFFFF" w:sz="0"/>
+          <w:left w:val="none" w:color="FFFFFF" w:sz="0"/>
+          <w:bottom w:val="none" w:color="FFFFFF" w:sz="0"/>
+          <w:right w:val="none" w:color="FFFFFF" w:sz="0"/>
+          <w:insideH w:val="none" w:color="FFFFFF" w:sz="0"/>
+          <w:insideV w:val="none" w:color="FFFFFF" w:sz="0"/>
+        </w:tblBorders>
+      </w:tblPr>
+      <w:tblGrid>
+        <w:gridCol w:w="4500"/>
+        <w:gridCol w:w="4500"/>
+      </w:tblGrid>
+      <w:tr>
+        <w:tc>
+          <w:tcPr>
+            <w:tcW w:type="dxa" w:w="4500"/>
+            <w:tcBorders>
+              <w:top w:val="none" w:color="FFFFFF" w:sz="0"/>
+              <w:left w:val="none" w:color="FFFFFF" w:sz="0"/>
+              <w:bottom w:val="none" w:color="FFFFFF" w:sz="0"/>
+              <w:right w:val="none" w:color="FFFFFF" w:sz="0"/>
+            </w:tcBorders>
+          </w:tcPr>
+          <w:p>
+            <w:pPr>
+              <w:jc w:val="center"/>
+            </w:pPr>
+            <w:r>
+              <w:drawing>
+                <wp:inline distT="0" distB="0" distL="0" distR="0">
+                  <wp:extent cx="2047875" cy="3219450"/>
+                  <wp:effectExtent t="0" r="0" b="0" l="0"/>
+                  <wp:docPr id="1" name="" descr="" title=""/>
+                  <wp:cNvGraphicFramePr>
+                    <a:graphicFrameLocks xmlns:a="http://schemas.openxmlformats.org/drawingml/2006/main" noChangeAspect="1"/>
+                  </wp:cNvGraphicFramePr>
+                  <a:graphic xmlns:a="http://schemas.openxmlformats.org/drawingml/2006/main">
+                    <a:graphicData uri="http://schemas.openxmlformats.org/drawingml/2006/picture">
+                      <pic:pic xmlns:pic="http://schemas.openxmlformats.org/drawingml/2006/picture">
+                        <pic:nvPicPr>
+                          <pic:cNvPr id="0" name="" descr=""/>
+                          <pic:cNvPicPr>
+                            <a:picLocks noChangeAspect="1" noChangeArrowheads="1"/>
+                          </pic:cNvPicPr>
+                        </pic:nvPicPr>
+                        <pic:blipFill>
+                          <a:blip r:embed="rId11" cstate="none"/>
+                          <a:srcRect/>
+                          <a:stretch>
+                            <a:fillRect/>
+                          </a:stretch>
+                        </pic:blipFill>
+                        <pic:spPr bwMode="auto">
+                          <a:xfrm>
+                            <a:off x="0" y="0"/>
+                            <a:ext cx="2047875" cy="3219450"/>
+                          </a:xfrm>
+                          <a:prstGeom prst="rect">
+                            <a:avLst/>
+                          </a:prstGeom>
+                        </pic:spPr>
+                      </pic:pic>
+                    </a:graphicData>
+                  </a:graphic>
+                </wp:inline>
+              </w:drawing>
+            </w:r>
+          </w:p>
+        </w:tc>
+        <w:tc>
+          <w:tcPr>
+            <w:tcW w:type="dxa" w:w="4500"/>
+            <w:tcBorders>
+              <w:top w:val="none" w:color="FFFFFF" w:sz="0"/>
+              <w:left w:val="none" w:color="FFFFFF" w:sz="0"/>
+              <w:bottom w:val="none" w:color="FFFFFF" w:sz="0"/>
+              <w:right w:val="none" w:color="FFFFFF" w:sz="0"/>
+            </w:tcBorders>
+          </w:tcPr>
+          <w:p>
+            <w:pPr>
+              <w:jc w:val="center"/>
+            </w:pPr>
+            <w:r>
+              <w:drawing>
+                <wp:inline distT="0" distB="0" distL="0" distR="0">
+                  <wp:extent cx="2047875" cy="3324225"/>
+                  <wp:effectExtent t="0" r="0" b="0" l="0"/>
+                  <wp:docPr id="1" name="" descr="" title=""/>
+                  <wp:cNvGraphicFramePr>
+                    <a:graphicFrameLocks xmlns:a="http://schemas.openxmlformats.org/drawingml/2006/main" noChangeAspect="1"/>
+                  </wp:cNvGraphicFramePr>
+                  <a:graphic xmlns:a="http://schemas.openxmlformats.org/drawingml/2006/main">
+                    <a:graphicData uri="http://schemas.openxmlformats.org/drawingml/2006/picture">
+                      <pic:pic xmlns:pic="http://schemas.openxmlformats.org/drawingml/2006/picture">
+                        <pic:nvPicPr>
+                          <pic:cNvPr id="0" name="" descr=""/>
+                          <pic:cNvPicPr>
+                            <a:picLocks noChangeAspect="1" noChangeArrowheads="1"/>
+                          </pic:cNvPicPr>
+                        </pic:nvPicPr>
+                        <pic:blipFill>
+                          <a:blip r:embed="rId12" cstate="none"/>
+                          <a:srcRect/>
+                          <a:stretch>
+                            <a:fillRect/>
+                          </a:stretch>
+                        </pic:blipFill>
+                        <pic:spPr bwMode="auto">
+                          <a:xfrm>
+                            <a:off x="0" y="0"/>
+                            <a:ext cx="2047875" cy="3324225"/>
+                          </a:xfrm>
+                          <a:prstGeom prst="rect">
+                            <a:avLst/>
+                          </a:prstGeom>
+                        </pic:spPr>
+                      </pic:pic>
+                    </a:graphicData>
+                  </a:graphic>
+                </wp:inline>
+              </w:drawing>
+            </w:r>
+          </w:p>
+        </w:tc>
+      </w:tr>
+    </w:tbl>
+    <w:p>
+      <w:pPr>
+        <w:spacing w:after="240" w:before="60"/>
+        <w:jc w:val="center"/>
+      </w:pPr>
+      <w:r>
+        <w:rPr>
+          <w:rFonts w:ascii="Arial" w:cs="Arial" w:eastAsia="Arial" w:hAnsi="Arial"/>
+          <w:i/>
+          <w:iCs/>
+          <w:color w:val="5A6B64"/>
+          <w:sz w:val="18"/>
+          <w:szCs w:val="18"/>
+        </w:rPr>
+        <w:t xml:space="preserve">Figura 3. Flujo H1 en el dispositivo (iOS, Expo Go). Izquierda: detalle de Costa 2; la curva cae por debajo del umbral mínimo (25 %) y sube al aplicarse el riego. Derecha: la orden "Regar 30 min" en estado Aplicado, la válvula abierta y el cierre programado persistido en Postgres.</w:t>
+      </w:r>
+    </w:p>
     <w:p>
       <w:pPr>
         <w:spacing w:after="120" w:line="300"/>
@@ -4915,7 +5063,7 @@
         <w:rPr>
           <w:rFonts w:ascii="Arial" w:cs="Arial" w:eastAsia="Arial" w:hAnsi="Arial"/>
         </w:rPr>
-        <w:t xml:space="preserve">Las capturas de pantalla y el video se entregan en la </w:t>
+        <w:t xml:space="preserve">El resto de las capturas y el video se entregan en la </w:t>
       </w:r>
       <w:r>
         <w:rPr>
@@ -4929,7 +5077,21 @@
         <w:rPr>
           <w:rFonts w:ascii="Arial" w:cs="Arial" w:eastAsia="Arial" w:hAnsi="Arial"/>
         </w:rPr>
-        <w:t xml:space="preserve">. Los archivos están numerados en el orden del recorrido de la demo:</w:t>
+        <w:t xml:space="preserve"> (</w:t>
+      </w:r>
+      <w:r>
+        <w:rPr>
+          <w:rFonts w:ascii="Consolas" w:cs="Consolas" w:eastAsia="Consolas" w:hAnsi="Consolas"/>
+          <w:sz w:val="20"/>
+          <w:szCs w:val="20"/>
+        </w:rPr>
+        <w:t xml:space="preserve">https://drive.google.com/drive/folders/1UZJpj1JMPmTomPVW7Gn4eeVX0fyFOBV7</w:t>
+      </w:r>
+      <w:r>
+        <w:rPr>
+          <w:rFonts w:ascii="Arial" w:cs="Arial" w:eastAsia="Arial" w:hAnsi="Arial"/>
+        </w:rPr>
+        <w:t xml:space="preserve">). Los archivos están numerados en el orden del recorrido de la demo:</w:t>
       </w:r>
     </w:p>
     <w:tbl>
@@ -6190,6 +6352,46 @@
           <w:rFonts w:ascii="Arial" w:cs="Arial" w:eastAsia="Arial" w:hAnsi="Arial"/>
         </w:rPr>
         <w:t xml:space="preserve">Anexo A. Cómo ejecutar</w:t>
+      </w:r>
+    </w:p>
+    <w:p>
+      <w:pPr>
+        <w:spacing w:after="120" w:line="300"/>
+        <w:jc w:val="both"/>
+      </w:pPr>
+      <w:r>
+        <w:rPr>
+          <w:rFonts w:ascii="Arial" w:cs="Arial" w:eastAsia="Arial" w:hAnsi="Arial"/>
+        </w:rPr>
+        <w:t xml:space="preserve">Repositorio: </w:t>
+      </w:r>
+      <w:r>
+        <w:rPr>
+          <w:rFonts w:ascii="Consolas" w:cs="Consolas" w:eastAsia="Consolas" w:hAnsi="Consolas"/>
+          <w:sz w:val="20"/>
+          <w:szCs w:val="20"/>
+        </w:rPr>
+        <w:t xml:space="preserve">https://github.com/Ovaleiva/tp4Agropulse</w:t>
+      </w:r>
+      <w:r>
+        <w:rPr>
+          <w:rFonts w:ascii="Arial" w:cs="Arial" w:eastAsia="Arial" w:hAnsi="Arial"/>
+        </w:rPr>
+        <w:t xml:space="preserve">. La guía detallada está en </w:t>
+      </w:r>
+      <w:r>
+        <w:rPr>
+          <w:rFonts w:ascii="Consolas" w:cs="Consolas" w:eastAsia="Consolas" w:hAnsi="Consolas"/>
+          <w:sz w:val="20"/>
+          <w:szCs w:val="20"/>
+        </w:rPr>
+        <w:t xml:space="preserve">GUIA_SUPABASE.md</w:t>
+      </w:r>
+      <w:r>
+        <w:rPr>
+          <w:rFonts w:ascii="Arial" w:cs="Arial" w:eastAsia="Arial" w:hAnsi="Arial"/>
+        </w:rPr>
+        <w:t xml:space="preserve">.</w:t>
       </w:r>
     </w:p>
     <w:p>

</xml_diff>